<commit_message>
docs: add 20 new fictitious store vendor accounts to UserList.docx
Adds one row per new non-restaurant store (2 per category, 10
categories) to the matching category table, alphabetically ordered
with the existing rows, and updates the total-accounts count (60 -> 80)
and per-category count (4 -> 6) to match.

Co-Authored-By: Claude Sonnet 5 <noreply@anthropic.com>
</commit_message>
<xml_diff>
--- a/docs/UserList.docx
+++ b/docs/UserList.docx
@@ -1151,7 +1151,7 @@
         <w:spacing w:after="200"/>
       </w:pPr>
       <w:r>
-        <w:t xml:space="preserve">The marketplace has grown beyond restaurants — every store below is its own vendor account, grouped by category. Four stores per category, all sharing the same password. Sign in at /vendor/login.</w:t>
+        <w:t xml:space="preserve">The marketplace has grown beyond restaurants — every store below is its own vendor account, grouped by category. Six stores per category (four original, plus two more added in a later pass), all sharing the same password. Sign in at /vendor/login.</w:t>
       </w:r>
     </w:p>
     <w:p>
@@ -1380,6 +1380,48 @@
           </w:tcPr>
           <w:p>
             <w:r>
+              <w:t xml:space="preserve">Harvest Greens</w:t>
+            </w:r>
+          </w:p>
+        </w:tc>
+        <w:tc>
+          <w:tcPr>
+            <w:tcW w:type="dxa" w:w="3800"/>
+          </w:tcPr>
+          <w:p>
+            <w:r>
+              <w:t xml:space="preserve">harvest-greens@foodhub.local</w:t>
+            </w:r>
+          </w:p>
+        </w:tc>
+        <w:tc>
+          <w:tcPr>
+            <w:tcW w:type="dxa" w:w="1800"/>
+          </w:tcPr>
+          <w:p>
+            <w:r>
+              <w:t xml:space="preserve">demo1234</w:t>
+            </w:r>
+          </w:p>
+        </w:tc>
+        <w:tc>
+          <w:tcPr>
+            <w:tcW w:type="dxa" w:w="1800"/>
+          </w:tcPr>
+          <w:p>
+            <w:r>
+              <w:t xml:space="preserve">Grocery</w:t>
+            </w:r>
+          </w:p>
+        </w:tc>
+      </w:tr>
+      <w:tr>
+        <w:tc>
+          <w:tcPr>
+            <w:tcW w:type="dxa" w:w="3000"/>
+          </w:tcPr>
+          <w:p>
+            <w:r>
               <w:t xml:space="preserve">Metro Grocery</w:t>
             </w:r>
           </w:p>
@@ -1391,6 +1433,48 @@
           <w:p>
             <w:r>
               <w:t xml:space="preserve">metro-grocery@foodhub.local</w:t>
+            </w:r>
+          </w:p>
+        </w:tc>
+        <w:tc>
+          <w:tcPr>
+            <w:tcW w:type="dxa" w:w="1800"/>
+          </w:tcPr>
+          <w:p>
+            <w:r>
+              <w:t xml:space="preserve">demo1234</w:t>
+            </w:r>
+          </w:p>
+        </w:tc>
+        <w:tc>
+          <w:tcPr>
+            <w:tcW w:type="dxa" w:w="1800"/>
+          </w:tcPr>
+          <w:p>
+            <w:r>
+              <w:t xml:space="preserve">Grocery</w:t>
+            </w:r>
+          </w:p>
+        </w:tc>
+      </w:tr>
+      <w:tr>
+        <w:tc>
+          <w:tcPr>
+            <w:tcW w:type="dxa" w:w="3000"/>
+          </w:tcPr>
+          <w:p>
+            <w:r>
+              <w:t xml:space="preserve">Pantry Post</w:t>
+            </w:r>
+          </w:p>
+        </w:tc>
+        <w:tc>
+          <w:tcPr>
+            <w:tcW w:type="dxa" w:w="3800"/>
+          </w:tcPr>
+          <w:p>
+            <w:r>
+              <w:t xml:space="preserve">pantry-post@foodhub.local</w:t>
             </w:r>
           </w:p>
         </w:tc>
@@ -1558,6 +1642,48 @@
           </w:tcPr>
           <w:p>
             <w:r>
+              <w:t xml:space="preserve">24Seven Store</w:t>
+            </w:r>
+          </w:p>
+        </w:tc>
+        <w:tc>
+          <w:tcPr>
+            <w:tcW w:type="dxa" w:w="3800"/>
+          </w:tcPr>
+          <w:p>
+            <w:r>
+              <w:t xml:space="preserve">24seven-store@foodhub.local</w:t>
+            </w:r>
+          </w:p>
+        </w:tc>
+        <w:tc>
+          <w:tcPr>
+            <w:tcW w:type="dxa" w:w="1800"/>
+          </w:tcPr>
+          <w:p>
+            <w:r>
+              <w:t xml:space="preserve">demo1234</w:t>
+            </w:r>
+          </w:p>
+        </w:tc>
+        <w:tc>
+          <w:tcPr>
+            <w:tcW w:type="dxa" w:w="1800"/>
+          </w:tcPr>
+          <w:p>
+            <w:r>
+              <w:t xml:space="preserve">Convenience</w:t>
+            </w:r>
+          </w:p>
+        </w:tc>
+      </w:tr>
+      <w:tr>
+        <w:tc>
+          <w:tcPr>
+            <w:tcW w:type="dxa" w:w="3000"/>
+          </w:tcPr>
+          <w:p>
+            <w:r>
               <w:t xml:space="preserve">Corner Store</w:t>
             </w:r>
           </w:p>
@@ -1569,6 +1695,48 @@
           <w:p>
             <w:r>
               <w:t xml:space="preserve">corner-store@foodhub.local</w:t>
+            </w:r>
+          </w:p>
+        </w:tc>
+        <w:tc>
+          <w:tcPr>
+            <w:tcW w:type="dxa" w:w="1800"/>
+          </w:tcPr>
+          <w:p>
+            <w:r>
+              <w:t xml:space="preserve">demo1234</w:t>
+            </w:r>
+          </w:p>
+        </w:tc>
+        <w:tc>
+          <w:tcPr>
+            <w:tcW w:type="dxa" w:w="1800"/>
+          </w:tcPr>
+          <w:p>
+            <w:r>
+              <w:t xml:space="preserve">Convenience</w:t>
+            </w:r>
+          </w:p>
+        </w:tc>
+      </w:tr>
+      <w:tr>
+        <w:tc>
+          <w:tcPr>
+            <w:tcW w:type="dxa" w:w="3000"/>
+          </w:tcPr>
+          <w:p>
+            <w:r>
+              <w:t xml:space="preserve">QuickBite Mart</w:t>
+            </w:r>
+          </w:p>
+        </w:tc>
+        <w:tc>
+          <w:tcPr>
+            <w:tcW w:type="dxa" w:w="3800"/>
+          </w:tcPr>
+          <w:p>
+            <w:r>
+              <w:t xml:space="preserve">quickbite-mart@foodhub.local</w:t>
             </w:r>
           </w:p>
         </w:tc>
@@ -1778,6 +1946,48 @@
           </w:tcPr>
           <w:p>
             <w:r>
+              <w:t xml:space="preserve">Barrel &amp; Bottle</w:t>
+            </w:r>
+          </w:p>
+        </w:tc>
+        <w:tc>
+          <w:tcPr>
+            <w:tcW w:type="dxa" w:w="3800"/>
+          </w:tcPr>
+          <w:p>
+            <w:r>
+              <w:t xml:space="preserve">barrel-and-bottle@foodhub.local</w:t>
+            </w:r>
+          </w:p>
+        </w:tc>
+        <w:tc>
+          <w:tcPr>
+            <w:tcW w:type="dxa" w:w="1800"/>
+          </w:tcPr>
+          <w:p>
+            <w:r>
+              <w:t xml:space="preserve">demo1234</w:t>
+            </w:r>
+          </w:p>
+        </w:tc>
+        <w:tc>
+          <w:tcPr>
+            <w:tcW w:type="dxa" w:w="1800"/>
+          </w:tcPr>
+          <w:p>
+            <w:r>
+              <w:t xml:space="preserve">Alcohol</w:t>
+            </w:r>
+          </w:p>
+        </w:tc>
+      </w:tr>
+      <w:tr>
+        <w:tc>
+          <w:tcPr>
+            <w:tcW w:type="dxa" w:w="3000"/>
+          </w:tcPr>
+          <w:p>
+            <w:r>
               <w:t xml:space="preserve">Craft Beer Co.</w:t>
             </w:r>
           </w:p>
@@ -1873,6 +2083,48 @@
           <w:p>
             <w:r>
               <w:t xml:space="preserve">the-bottle-shop@foodhub.local</w:t>
+            </w:r>
+          </w:p>
+        </w:tc>
+        <w:tc>
+          <w:tcPr>
+            <w:tcW w:type="dxa" w:w="1800"/>
+          </w:tcPr>
+          <w:p>
+            <w:r>
+              <w:t xml:space="preserve">demo1234</w:t>
+            </w:r>
+          </w:p>
+        </w:tc>
+        <w:tc>
+          <w:tcPr>
+            <w:tcW w:type="dxa" w:w="1800"/>
+          </w:tcPr>
+          <w:p>
+            <w:r>
+              <w:t xml:space="preserve">Alcohol</w:t>
+            </w:r>
+          </w:p>
+        </w:tc>
+      </w:tr>
+      <w:tr>
+        <w:tc>
+          <w:tcPr>
+            <w:tcW w:type="dxa" w:w="3000"/>
+          </w:tcPr>
+          <w:p>
+            <w:r>
+              <w:t xml:space="preserve">The Liquor Loft</w:t>
+            </w:r>
+          </w:p>
+        </w:tc>
+        <w:tc>
+          <w:tcPr>
+            <w:tcW w:type="dxa" w:w="3800"/>
+          </w:tcPr>
+          <w:p>
+            <w:r>
+              <w:t xml:space="preserve">the-liquor-loft@foodhub.local</w:t>
             </w:r>
           </w:p>
         </w:tc>
@@ -2082,6 +2334,48 @@
           </w:tcPr>
           <w:p>
             <w:r>
+              <w:t xml:space="preserve">HealthFirst Pharmacy</w:t>
+            </w:r>
+          </w:p>
+        </w:tc>
+        <w:tc>
+          <w:tcPr>
+            <w:tcW w:type="dxa" w:w="3800"/>
+          </w:tcPr>
+          <w:p>
+            <w:r>
+              <w:t xml:space="preserve">healthfirst-pharmacy@foodhub.local</w:t>
+            </w:r>
+          </w:p>
+        </w:tc>
+        <w:tc>
+          <w:tcPr>
+            <w:tcW w:type="dxa" w:w="1800"/>
+          </w:tcPr>
+          <w:p>
+            <w:r>
+              <w:t xml:space="preserve">demo1234</w:t>
+            </w:r>
+          </w:p>
+        </w:tc>
+        <w:tc>
+          <w:tcPr>
+            <w:tcW w:type="dxa" w:w="1800"/>
+          </w:tcPr>
+          <w:p>
+            <w:r>
+              <w:t xml:space="preserve">Health</w:t>
+            </w:r>
+          </w:p>
+        </w:tc>
+      </w:tr>
+      <w:tr>
+        <w:tc>
+          <w:tcPr>
+            <w:tcW w:type="dxa" w:w="3000"/>
+          </w:tcPr>
+          <w:p>
+            <w:r>
               <w:t xml:space="preserve">MedPlus Pharmacy</w:t>
             </w:r>
           </w:p>
@@ -2093,6 +2387,48 @@
           <w:p>
             <w:r>
               <w:t xml:space="preserve">medplus-pharmacy@foodhub.local</w:t>
+            </w:r>
+          </w:p>
+        </w:tc>
+        <w:tc>
+          <w:tcPr>
+            <w:tcW w:type="dxa" w:w="1800"/>
+          </w:tcPr>
+          <w:p>
+            <w:r>
+              <w:t xml:space="preserve">demo1234</w:t>
+            </w:r>
+          </w:p>
+        </w:tc>
+        <w:tc>
+          <w:tcPr>
+            <w:tcW w:type="dxa" w:w="1800"/>
+          </w:tcPr>
+          <w:p>
+            <w:r>
+              <w:t xml:space="preserve">Health</w:t>
+            </w:r>
+          </w:p>
+        </w:tc>
+      </w:tr>
+      <w:tr>
+        <w:tc>
+          <w:tcPr>
+            <w:tcW w:type="dxa" w:w="3000"/>
+          </w:tcPr>
+          <w:p>
+            <w:r>
+              <w:t xml:space="preserve">Nature Cure Clinic</w:t>
+            </w:r>
+          </w:p>
+        </w:tc>
+        <w:tc>
+          <w:tcPr>
+            <w:tcW w:type="dxa" w:w="3800"/>
+          </w:tcPr>
+          <w:p>
+            <w:r>
+              <w:t xml:space="preserve">nature-cure-clinic@foodhub.local</w:t>
             </w:r>
           </w:p>
         </w:tc>
@@ -2428,6 +2764,48 @@
           </w:tcPr>
           <w:p>
             <w:r>
+              <w:t xml:space="preserve">Trend Corner</w:t>
+            </w:r>
+          </w:p>
+        </w:tc>
+        <w:tc>
+          <w:tcPr>
+            <w:tcW w:type="dxa" w:w="3800"/>
+          </w:tcPr>
+          <w:p>
+            <w:r>
+              <w:t xml:space="preserve">trend-corner@foodhub.local</w:t>
+            </w:r>
+          </w:p>
+        </w:tc>
+        <w:tc>
+          <w:tcPr>
+            <w:tcW w:type="dxa" w:w="1800"/>
+          </w:tcPr>
+          <w:p>
+            <w:r>
+              <w:t xml:space="preserve">demo1234</w:t>
+            </w:r>
+          </w:p>
+        </w:tc>
+        <w:tc>
+          <w:tcPr>
+            <w:tcW w:type="dxa" w:w="1800"/>
+          </w:tcPr>
+          <w:p>
+            <w:r>
+              <w:t xml:space="preserve">Retail</w:t>
+            </w:r>
+          </w:p>
+        </w:tc>
+      </w:tr>
+      <w:tr>
+        <w:tc>
+          <w:tcPr>
+            <w:tcW w:type="dxa" w:w="3000"/>
+          </w:tcPr>
+          <w:p>
+            <w:r>
               <w:t xml:space="preserve">Urban Living</w:t>
             </w:r>
           </w:p>
@@ -2439,6 +2817,48 @@
           <w:p>
             <w:r>
               <w:t xml:space="preserve">urban-living@foodhub.local</w:t>
+            </w:r>
+          </w:p>
+        </w:tc>
+        <w:tc>
+          <w:tcPr>
+            <w:tcW w:type="dxa" w:w="1800"/>
+          </w:tcPr>
+          <w:p>
+            <w:r>
+              <w:t xml:space="preserve">demo1234</w:t>
+            </w:r>
+          </w:p>
+        </w:tc>
+        <w:tc>
+          <w:tcPr>
+            <w:tcW w:type="dxa" w:w="1800"/>
+          </w:tcPr>
+          <w:p>
+            <w:r>
+              <w:t xml:space="preserve">Retail</w:t>
+            </w:r>
+          </w:p>
+        </w:tc>
+      </w:tr>
+      <w:tr>
+        <w:tc>
+          <w:tcPr>
+            <w:tcW w:type="dxa" w:w="3000"/>
+          </w:tcPr>
+          <w:p>
+            <w:r>
+              <w:t xml:space="preserve">Urban Nest</w:t>
+            </w:r>
+          </w:p>
+        </w:tc>
+        <w:tc>
+          <w:tcPr>
+            <w:tcW w:type="dxa" w:w="3800"/>
+          </w:tcPr>
+          <w:p>
+            <w:r>
+              <w:t xml:space="preserve">urban-nest@foodhub.local</w:t>
             </w:r>
           </w:p>
         </w:tc>
@@ -2606,6 +3026,48 @@
           </w:tcPr>
           <w:p>
             <w:r>
+              <w:t xml:space="preserve">Happy Paws Supply</w:t>
+            </w:r>
+          </w:p>
+        </w:tc>
+        <w:tc>
+          <w:tcPr>
+            <w:tcW w:type="dxa" w:w="3800"/>
+          </w:tcPr>
+          <w:p>
+            <w:r>
+              <w:t xml:space="preserve">happy-paws-supply@foodhub.local</w:t>
+            </w:r>
+          </w:p>
+        </w:tc>
+        <w:tc>
+          <w:tcPr>
+            <w:tcW w:type="dxa" w:w="1800"/>
+          </w:tcPr>
+          <w:p>
+            <w:r>
+              <w:t xml:space="preserve">demo1234</w:t>
+            </w:r>
+          </w:p>
+        </w:tc>
+        <w:tc>
+          <w:tcPr>
+            <w:tcW w:type="dxa" w:w="1800"/>
+          </w:tcPr>
+          <w:p>
+            <w:r>
+              <w:t xml:space="preserve">Pet</w:t>
+            </w:r>
+          </w:p>
+        </w:tc>
+      </w:tr>
+      <w:tr>
+        <w:tc>
+          <w:tcPr>
+            <w:tcW w:type="dxa" w:w="3000"/>
+          </w:tcPr>
+          <w:p>
+            <w:r>
               <w:t xml:space="preserve">Paws &amp; Claws</w:t>
             </w:r>
           </w:p>
@@ -2659,6 +3121,48 @@
           <w:p>
             <w:r>
               <w:t xml:space="preserve">pet-corner@foodhub.local</w:t>
+            </w:r>
+          </w:p>
+        </w:tc>
+        <w:tc>
+          <w:tcPr>
+            <w:tcW w:type="dxa" w:w="1800"/>
+          </w:tcPr>
+          <w:p>
+            <w:r>
+              <w:t xml:space="preserve">demo1234</w:t>
+            </w:r>
+          </w:p>
+        </w:tc>
+        <w:tc>
+          <w:tcPr>
+            <w:tcW w:type="dxa" w:w="1800"/>
+          </w:tcPr>
+          <w:p>
+            <w:r>
+              <w:t xml:space="preserve">Pet</w:t>
+            </w:r>
+          </w:p>
+        </w:tc>
+      </w:tr>
+      <w:tr>
+        <w:tc>
+          <w:tcPr>
+            <w:tcW w:type="dxa" w:w="3000"/>
+          </w:tcPr>
+          <w:p>
+            <w:r>
+              <w:t xml:space="preserve">Wagging Tails</w:t>
+            </w:r>
+          </w:p>
+        </w:tc>
+        <w:tc>
+          <w:tcPr>
+            <w:tcW w:type="dxa" w:w="3800"/>
+          </w:tcPr>
+          <w:p>
+            <w:r>
+              <w:t xml:space="preserve">wagging-tails@foodhub.local</w:t>
             </w:r>
           </w:p>
         </w:tc>
@@ -2868,6 +3372,48 @@
           </w:tcPr>
           <w:p>
             <w:r>
+              <w:t xml:space="preserve">Bloom Street</w:t>
+            </w:r>
+          </w:p>
+        </w:tc>
+        <w:tc>
+          <w:tcPr>
+            <w:tcW w:type="dxa" w:w="3800"/>
+          </w:tcPr>
+          <w:p>
+            <w:r>
+              <w:t xml:space="preserve">bloom-street@foodhub.local</w:t>
+            </w:r>
+          </w:p>
+        </w:tc>
+        <w:tc>
+          <w:tcPr>
+            <w:tcW w:type="dxa" w:w="1800"/>
+          </w:tcPr>
+          <w:p>
+            <w:r>
+              <w:t xml:space="preserve">demo1234</w:t>
+            </w:r>
+          </w:p>
+        </w:tc>
+        <w:tc>
+          <w:tcPr>
+            <w:tcW w:type="dxa" w:w="1800"/>
+          </w:tcPr>
+          <w:p>
+            <w:r>
+              <w:t xml:space="preserve">Flowers</w:t>
+            </w:r>
+          </w:p>
+        </w:tc>
+      </w:tr>
+      <w:tr>
+        <w:tc>
+          <w:tcPr>
+            <w:tcW w:type="dxa" w:w="3000"/>
+          </w:tcPr>
+          <w:p>
+            <w:r>
               <w:t xml:space="preserve">Fresh Petals Co.</w:t>
             </w:r>
           </w:p>
@@ -2921,6 +3467,48 @@
           <w:p>
             <w:r>
               <w:t xml:space="preserve">petal-bloom@foodhub.local</w:t>
+            </w:r>
+          </w:p>
+        </w:tc>
+        <w:tc>
+          <w:tcPr>
+            <w:tcW w:type="dxa" w:w="1800"/>
+          </w:tcPr>
+          <w:p>
+            <w:r>
+              <w:t xml:space="preserve">demo1234</w:t>
+            </w:r>
+          </w:p>
+        </w:tc>
+        <w:tc>
+          <w:tcPr>
+            <w:tcW w:type="dxa" w:w="1800"/>
+          </w:tcPr>
+          <w:p>
+            <w:r>
+              <w:t xml:space="preserve">Flowers</w:t>
+            </w:r>
+          </w:p>
+        </w:tc>
+      </w:tr>
+      <w:tr>
+        <w:tc>
+          <w:tcPr>
+            <w:tcW w:type="dxa" w:w="3000"/>
+          </w:tcPr>
+          <w:p>
+            <w:r>
+              <w:t xml:space="preserve">Petal &amp; Vine</w:t>
+            </w:r>
+          </w:p>
+        </w:tc>
+        <w:tc>
+          <w:tcPr>
+            <w:tcW w:type="dxa" w:w="3800"/>
+          </w:tcPr>
+          <w:p>
+            <w:r>
+              <w:t xml:space="preserve">petal-and-vine@foodhub.local</w:t>
             </w:r>
           </w:p>
         </w:tc>
@@ -3172,6 +3760,48 @@
           </w:tcPr>
           <w:p>
             <w:r>
+              <w:t xml:space="preserve">Little Nest Baby</w:t>
+            </w:r>
+          </w:p>
+        </w:tc>
+        <w:tc>
+          <w:tcPr>
+            <w:tcW w:type="dxa" w:w="3800"/>
+          </w:tcPr>
+          <w:p>
+            <w:r>
+              <w:t xml:space="preserve">little-nest-baby@foodhub.local</w:t>
+            </w:r>
+          </w:p>
+        </w:tc>
+        <w:tc>
+          <w:tcPr>
+            <w:tcW w:type="dxa" w:w="1800"/>
+          </w:tcPr>
+          <w:p>
+            <w:r>
+              <w:t xml:space="preserve">demo1234</w:t>
+            </w:r>
+          </w:p>
+        </w:tc>
+        <w:tc>
+          <w:tcPr>
+            <w:tcW w:type="dxa" w:w="1800"/>
+          </w:tcPr>
+          <w:p>
+            <w:r>
+              <w:t xml:space="preserve">Baby</w:t>
+            </w:r>
+          </w:p>
+        </w:tc>
+      </w:tr>
+      <w:tr>
+        <w:tc>
+          <w:tcPr>
+            <w:tcW w:type="dxa" w:w="3000"/>
+          </w:tcPr>
+          <w:p>
+            <w:r>
               <w:t xml:space="preserve">Little Steps</w:t>
             </w:r>
           </w:p>
@@ -3225,6 +3855,48 @@
           <w:p>
             <w:r>
               <w:t xml:space="preserve">tiny-tots-store@foodhub.local</w:t>
+            </w:r>
+          </w:p>
+        </w:tc>
+        <w:tc>
+          <w:tcPr>
+            <w:tcW w:type="dxa" w:w="1800"/>
+          </w:tcPr>
+          <w:p>
+            <w:r>
+              <w:t xml:space="preserve">demo1234</w:t>
+            </w:r>
+          </w:p>
+        </w:tc>
+        <w:tc>
+          <w:tcPr>
+            <w:tcW w:type="dxa" w:w="1800"/>
+          </w:tcPr>
+          <w:p>
+            <w:r>
+              <w:t xml:space="preserve">Baby</w:t>
+            </w:r>
+          </w:p>
+        </w:tc>
+      </w:tr>
+      <w:tr>
+        <w:tc>
+          <w:tcPr>
+            <w:tcW w:type="dxa" w:w="3000"/>
+          </w:tcPr>
+          <w:p>
+            <w:r>
+              <w:t xml:space="preserve">Tiny Treasures</w:t>
+            </w:r>
+          </w:p>
+        </w:tc>
+        <w:tc>
+          <w:tcPr>
+            <w:tcW w:type="dxa" w:w="3800"/>
+          </w:tcPr>
+          <w:p>
+            <w:r>
+              <w:t xml:space="preserve">tiny-treasures@foodhub.local</w:t>
             </w:r>
           </w:p>
         </w:tc>
@@ -3511,6 +4183,90 @@
           </w:p>
         </w:tc>
       </w:tr>
+      <w:tr>
+        <w:tc>
+          <w:tcPr>
+            <w:tcW w:type="dxa" w:w="3000"/>
+          </w:tcPr>
+          <w:p>
+            <w:r>
+              <w:t xml:space="preserve">Radiant Skin Lab</w:t>
+            </w:r>
+          </w:p>
+        </w:tc>
+        <w:tc>
+          <w:tcPr>
+            <w:tcW w:type="dxa" w:w="3800"/>
+          </w:tcPr>
+          <w:p>
+            <w:r>
+              <w:t xml:space="preserve">radiant-skin-lab@foodhub.local</w:t>
+            </w:r>
+          </w:p>
+        </w:tc>
+        <w:tc>
+          <w:tcPr>
+            <w:tcW w:type="dxa" w:w="1800"/>
+          </w:tcPr>
+          <w:p>
+            <w:r>
+              <w:t xml:space="preserve">demo1234</w:t>
+            </w:r>
+          </w:p>
+        </w:tc>
+        <w:tc>
+          <w:tcPr>
+            <w:tcW w:type="dxa" w:w="1800"/>
+          </w:tcPr>
+          <w:p>
+            <w:r>
+              <w:t xml:space="preserve">Personal Care</w:t>
+            </w:r>
+          </w:p>
+        </w:tc>
+      </w:tr>
+      <w:tr>
+        <w:tc>
+          <w:tcPr>
+            <w:tcW w:type="dxa" w:w="3000"/>
+          </w:tcPr>
+          <w:p>
+            <w:r>
+              <w:t xml:space="preserve">Shine &amp; Glow</w:t>
+            </w:r>
+          </w:p>
+        </w:tc>
+        <w:tc>
+          <w:tcPr>
+            <w:tcW w:type="dxa" w:w="3800"/>
+          </w:tcPr>
+          <w:p>
+            <w:r>
+              <w:t xml:space="preserve">shine-and-glow@foodhub.local</w:t>
+            </w:r>
+          </w:p>
+        </w:tc>
+        <w:tc>
+          <w:tcPr>
+            <w:tcW w:type="dxa" w:w="1800"/>
+          </w:tcPr>
+          <w:p>
+            <w:r>
+              <w:t xml:space="preserve">demo1234</w:t>
+            </w:r>
+          </w:p>
+        </w:tc>
+        <w:tc>
+          <w:tcPr>
+            <w:tcW w:type="dxa" w:w="1800"/>
+          </w:tcPr>
+          <w:p>
+            <w:r>
+              <w:t xml:space="preserve">Personal Care</w:t>
+            </w:r>
+          </w:p>
+        </w:tc>
+      </w:tr>
     </w:tbl>
     <w:p>
       <w:pPr>
@@ -3612,6 +4368,48 @@
           </w:tcPr>
           <w:p>
             <w:r>
+              <w:t xml:space="preserve">ByteWorks</w:t>
+            </w:r>
+          </w:p>
+        </w:tc>
+        <w:tc>
+          <w:tcPr>
+            <w:tcW w:type="dxa" w:w="3800"/>
+          </w:tcPr>
+          <w:p>
+            <w:r>
+              <w:t xml:space="preserve">byteworks@foodhub.local</w:t>
+            </w:r>
+          </w:p>
+        </w:tc>
+        <w:tc>
+          <w:tcPr>
+            <w:tcW w:type="dxa" w:w="1800"/>
+          </w:tcPr>
+          <w:p>
+            <w:r>
+              <w:t xml:space="preserve">demo1234</w:t>
+            </w:r>
+          </w:p>
+        </w:tc>
+        <w:tc>
+          <w:tcPr>
+            <w:tcW w:type="dxa" w:w="1800"/>
+          </w:tcPr>
+          <w:p>
+            <w:r>
+              <w:t xml:space="preserve">Electronics</w:t>
+            </w:r>
+          </w:p>
+        </w:tc>
+      </w:tr>
+      <w:tr>
+        <w:tc>
+          <w:tcPr>
+            <w:tcW w:type="dxa" w:w="3000"/>
+          </w:tcPr>
+          <w:p>
+            <w:r>
               <w:t xml:space="preserve">CircuitPoint</w:t>
             </w:r>
           </w:p>
@@ -3707,6 +4505,48 @@
           <w:p>
             <w:r>
               <w:t xml:space="preserve">gadget-world@foodhub.local</w:t>
+            </w:r>
+          </w:p>
+        </w:tc>
+        <w:tc>
+          <w:tcPr>
+            <w:tcW w:type="dxa" w:w="1800"/>
+          </w:tcPr>
+          <w:p>
+            <w:r>
+              <w:t xml:space="preserve">demo1234</w:t>
+            </w:r>
+          </w:p>
+        </w:tc>
+        <w:tc>
+          <w:tcPr>
+            <w:tcW w:type="dxa" w:w="1800"/>
+          </w:tcPr>
+          <w:p>
+            <w:r>
+              <w:t xml:space="preserve">Electronics</w:t>
+            </w:r>
+          </w:p>
+        </w:tc>
+      </w:tr>
+      <w:tr>
+        <w:tc>
+          <w:tcPr>
+            <w:tcW w:type="dxa" w:w="3000"/>
+          </w:tcPr>
+          <w:p>
+            <w:r>
+              <w:t xml:space="preserve">Circuit City Store</w:t>
+            </w:r>
+          </w:p>
+        </w:tc>
+        <w:tc>
+          <w:tcPr>
+            <w:tcW w:type="dxa" w:w="3800"/>
+          </w:tcPr>
+          <w:p>
+            <w:r>
+              <w:t xml:space="preserve">circuit-city-store@foodhub.local</w:t>
             </w:r>
           </w:p>
         </w:tc>
@@ -3806,7 +4646,7 @@
         <w:spacing w:after="100"/>
       </w:pPr>
       <w:r>
-        <w:t xml:space="preserve">60 accounts total: 4 core-role accounts, 16 restaurant vendor accounts, and 40 non-restaurant marketplace vendor accounts (10 categories × 4 stores each: Grocery, Convenience, Alcohol, Health, Retail, Pet, Flowers, Baby, Personal Care, Electronics).</w:t>
+        <w:t xml:space="preserve">80 accounts total: 4 core-role accounts, 16 restaurant vendor accounts, and 60 non-restaurant marketplace vendor accounts (10 categories × 6 stores each: Grocery, Convenience, Alcohol, Health, Retail, Pet, Flowers, Baby, Personal Care, Electronics).</w:t>
       </w:r>
     </w:p>
     <w:p>
@@ -3832,7 +4672,7 @@
         <w:spacing w:after="100"/>
       </w:pPr>
       <w:r>
-        <w:t xml:space="preserve">Re-running "npx supabase db reset" restores exactly these 60 accounts with exactly these passwords every time.</w:t>
+        <w:t xml:space="preserve">Re-running "npx supabase db reset" restores exactly these 80 accounts with exactly these passwords every time.</w:t>
       </w:r>
     </w:p>
     <w:sectPr>

</xml_diff>

<commit_message>
docs: add multi-port role URLs to UserList.docx
New "1.1 Role Interface URLs (Local Dev)" section: Customer/Vendor/
Delivery/Admin URL+port table (3000-3003) plus a note on why (each
port is its own browser origin, no session collisions) and how to
start them (npm run app:start:all-roles vs. the single-port default).

Co-Authored-By: Claude Sonnet 5 <noreply@anthropic.com>
</commit_message>
<xml_diff>
--- a/docs/UserList.docx
+++ b/docs/UserList.docx
@@ -358,6 +358,276 @@
           <w:p>
             <w:r>
               <w:t xml:space="preserve">The original demo restaurant — indian, fast_food menu.</w:t>
+            </w:r>
+          </w:p>
+        </w:tc>
+      </w:tr>
+    </w:tbl>
+    <w:p>
+      <w:pPr>
+        <w:pStyle w:val="Heading2"/>
+        <w:spacing w:before="200"/>
+      </w:pPr>
+      <w:r>
+        <w:t xml:space="preserve">1.1 Role Interface URLs (Local Dev)</w:t>
+      </w:r>
+    </w:p>
+    <w:p>
+      <w:pPr>
+        <w:spacing w:after="200"/>
+      </w:pPr>
+      <w:r>
+        <w:t xml:space="preserve">Each role now runs on its own port, which means its own browser origin — so all 4 roles can be logged in at the same time in the same browser without one login overwriting another’s session. Run “npm run app:start:all-roles” (or “.\scripts\start.ps1 -Dev -AllRoles”) to start all four ports at once. For single-role work, the default “npm run app:start:dev” still runs everything on :3000 alone, with roles told apart by login path (e.g. /vendor/login) as shown in the table above.</w:t>
+      </w:r>
+    </w:p>
+    <w:tbl>
+      <w:tblPr>
+        <w:tblW w:type="dxa" w:w="10400"/>
+        <w:tblBorders>
+          <w:top w:val="single" w:color="auto" w:sz="4"/>
+          <w:left w:val="single" w:color="auto" w:sz="4"/>
+          <w:bottom w:val="single" w:color="auto" w:sz="4"/>
+          <w:right w:val="single" w:color="auto" w:sz="4"/>
+          <w:insideH w:val="single" w:color="auto" w:sz="4"/>
+          <w:insideV w:val="single" w:color="auto" w:sz="4"/>
+        </w:tblBorders>
+      </w:tblPr>
+      <w:tblGrid>
+        <w:gridCol w:w="1700"/>
+        <w:gridCol w:w="3200"/>
+        <w:gridCol w:w="1600"/>
+        <w:gridCol w:w="3900"/>
+      </w:tblGrid>
+      <w:tr>
+        <w:tc>
+          <w:tcPr>
+            <w:tcW w:type="dxa" w:w="1700"/>
+            <w:shd w:fill="2E5339" w:color="auto" w:val="clear"/>
+          </w:tcPr>
+          <w:p>
+            <w:r>
+              <w:rPr>
+                <w:b/>
+                <w:bCs/>
+                <w:color w:val="FFFFFF"/>
+              </w:rPr>
+              <w:t xml:space="preserve">Role</w:t>
+            </w:r>
+          </w:p>
+        </w:tc>
+        <w:tc>
+          <w:tcPr>
+            <w:tcW w:type="dxa" w:w="3200"/>
+            <w:shd w:fill="2E5339" w:color="auto" w:val="clear"/>
+          </w:tcPr>
+          <w:p>
+            <w:r>
+              <w:rPr>
+                <w:b/>
+                <w:bCs/>
+                <w:color w:val="FFFFFF"/>
+              </w:rPr>
+              <w:t xml:space="preserve">Local URL</w:t>
+            </w:r>
+          </w:p>
+        </w:tc>
+        <w:tc>
+          <w:tcPr>
+            <w:tcW w:type="dxa" w:w="1600"/>
+            <w:shd w:fill="2E5339" w:color="auto" w:val="clear"/>
+          </w:tcPr>
+          <w:p>
+            <w:r>
+              <w:rPr>
+                <w:b/>
+                <w:bCs/>
+                <w:color w:val="FFFFFF"/>
+              </w:rPr>
+              <w:t xml:space="preserve">Port</w:t>
+            </w:r>
+          </w:p>
+        </w:tc>
+        <w:tc>
+          <w:tcPr>
+            <w:tcW w:type="dxa" w:w="3900"/>
+            <w:shd w:fill="2E5339" w:color="auto" w:val="clear"/>
+          </w:tcPr>
+          <w:p>
+            <w:r>
+              <w:rPr>
+                <w:b/>
+                <w:bCs/>
+                <w:color w:val="FFFFFF"/>
+              </w:rPr>
+              <w:t xml:space="preserve">Purpose</w:t>
+            </w:r>
+          </w:p>
+        </w:tc>
+      </w:tr>
+      <w:tr>
+        <w:tc>
+          <w:tcPr>
+            <w:tcW w:type="dxa" w:w="1700"/>
+          </w:tcPr>
+          <w:p>
+            <w:r>
+              <w:t xml:space="preserve">Customer</w:t>
+            </w:r>
+          </w:p>
+        </w:tc>
+        <w:tc>
+          <w:tcPr>
+            <w:tcW w:type="dxa" w:w="3200"/>
+          </w:tcPr>
+          <w:p>
+            <w:r>
+              <w:t xml:space="preserve">http://localhost:3000</w:t>
+            </w:r>
+          </w:p>
+        </w:tc>
+        <w:tc>
+          <w:tcPr>
+            <w:tcW w:type="dxa" w:w="1600"/>
+          </w:tcPr>
+          <w:p>
+            <w:r>
+              <w:t xml:space="preserve">3000</w:t>
+            </w:r>
+          </w:p>
+        </w:tc>
+        <w:tc>
+          <w:tcPr>
+            <w:tcW w:type="dxa" w:w="3900"/>
+          </w:tcPr>
+          <w:p>
+            <w:r>
+              <w:t xml:space="preserve">Browse, order, checkout (default port when running a single role).</w:t>
+            </w:r>
+          </w:p>
+        </w:tc>
+      </w:tr>
+      <w:tr>
+        <w:tc>
+          <w:tcPr>
+            <w:tcW w:type="dxa" w:w="1700"/>
+          </w:tcPr>
+          <w:p>
+            <w:r>
+              <w:t xml:space="preserve">Vendor</w:t>
+            </w:r>
+          </w:p>
+        </w:tc>
+        <w:tc>
+          <w:tcPr>
+            <w:tcW w:type="dxa" w:w="3200"/>
+          </w:tcPr>
+          <w:p>
+            <w:r>
+              <w:t xml:space="preserve">http://localhost:3001</w:t>
+            </w:r>
+          </w:p>
+        </w:tc>
+        <w:tc>
+          <w:tcPr>
+            <w:tcW w:type="dxa" w:w="1600"/>
+          </w:tcPr>
+          <w:p>
+            <w:r>
+              <w:t xml:space="preserve">3001</w:t>
+            </w:r>
+          </w:p>
+        </w:tc>
+        <w:tc>
+          <w:tcPr>
+            <w:tcW w:type="dxa" w:w="3900"/>
+          </w:tcPr>
+          <w:p>
+            <w:r>
+              <w:t xml:space="preserve">Manage restaurant/store menu and incoming orders.</w:t>
+            </w:r>
+          </w:p>
+        </w:tc>
+      </w:tr>
+      <w:tr>
+        <w:tc>
+          <w:tcPr>
+            <w:tcW w:type="dxa" w:w="1700"/>
+          </w:tcPr>
+          <w:p>
+            <w:r>
+              <w:t xml:space="preserve">Delivery Partner</w:t>
+            </w:r>
+          </w:p>
+        </w:tc>
+        <w:tc>
+          <w:tcPr>
+            <w:tcW w:type="dxa" w:w="3200"/>
+          </w:tcPr>
+          <w:p>
+            <w:r>
+              <w:t xml:space="preserve">http://localhost:3002</w:t>
+            </w:r>
+          </w:p>
+        </w:tc>
+        <w:tc>
+          <w:tcPr>
+            <w:tcW w:type="dxa" w:w="1600"/>
+          </w:tcPr>
+          <w:p>
+            <w:r>
+              <w:t xml:space="preserve">3002</w:t>
+            </w:r>
+          </w:p>
+        </w:tc>
+        <w:tc>
+          <w:tcPr>
+            <w:tcW w:type="dxa" w:w="3900"/>
+          </w:tcPr>
+          <w:p>
+            <w:r>
+              <w:t xml:space="preserve">Go online, accept and fulfill deliveries.</w:t>
+            </w:r>
+          </w:p>
+        </w:tc>
+      </w:tr>
+      <w:tr>
+        <w:tc>
+          <w:tcPr>
+            <w:tcW w:type="dxa" w:w="1700"/>
+          </w:tcPr>
+          <w:p>
+            <w:r>
+              <w:t xml:space="preserve">Admin</w:t>
+            </w:r>
+          </w:p>
+        </w:tc>
+        <w:tc>
+          <w:tcPr>
+            <w:tcW w:type="dxa" w:w="3200"/>
+          </w:tcPr>
+          <w:p>
+            <w:r>
+              <w:t xml:space="preserve">http://localhost:3003</w:t>
+            </w:r>
+          </w:p>
+        </w:tc>
+        <w:tc>
+          <w:tcPr>
+            <w:tcW w:type="dxa" w:w="1600"/>
+          </w:tcPr>
+          <w:p>
+            <w:r>
+              <w:t xml:space="preserve">3003</w:t>
+            </w:r>
+          </w:p>
+        </w:tc>
+        <w:tc>
+          <w:tcPr>
+            <w:tcW w:type="dxa" w:w="3900"/>
+          </w:tcPr>
+          <w:p>
+            <w:r>
+              <w:t xml:space="preserve">Platform-wide oversight — orders, restaurants, delivery partners.</w:t>
             </w:r>
           </w:p>
         </w:tc>

</xml_diff>